<commit_message>
docs: finalize A330EFB 1.1 acceptance and Word deliverables
</commit_message>
<xml_diff>
--- a/output/word/A330EFB投标演示版实施任务书.docx
+++ b/output/word/A330EFB投标演示版实施任务书.docx
@@ -95,7 +95,7 @@
         <w:rPr>
           <w:b w:val="0"/>
         </w:rPr>
-        <w:t>验收证据：完善方案、实施任务书及任务清单已编制；Word 初稿共 7 页，逐页排版复核完成。</w:t>
+        <w:t>验收证据：完善方案、实施任务书及任务清单已编制；两份 Word 自然分页，全部页面完成排版复核。</w:t>
       </w:r>
     </w:p>
     <w:p>
@@ -527,7 +527,7 @@
         <w:rPr>
           <w:b w:val="0"/>
         </w:rPr>
-        <w:t>验收证据：本地构建、57 项单元与 37 项浏览器检查通过；PDF 与收藏页的后续修订单独回归，远端还将执行全部检查。</w:t>
+        <w:t>验收证据：57 项单元与 37 项浏览器检查通过；四套工作流执行 46 步，Windows 与 Ubuntu 远端完整回归通过。</w:t>
       </w:r>
     </w:p>
     <w:p>
@@ -551,7 +551,7 @@
         <w:rPr>
           <w:b w:val="0"/>
         </w:rPr>
-        <w:t>前置任务：T10。当前状态：实施中。</w:t>
+        <w:t>前置任务：T10。当前状态：已完成。</w:t>
       </w:r>
     </w:p>
     <w:p>
@@ -575,7 +575,7 @@
         <w:rPr>
           <w:b w:val="0"/>
         </w:rPr>
-        <w:t>验收证据：操作补充说明含实际程序截图；设计变更说明与 README 已同步，Word 正在完成最终状态更新。</w:t>
+        <w:t>验收证据：两份 Word 共 8 页，逐页复核完成；设计变更、带实际截图的操作补充说明、README 和验收记录已同步。</w:t>
       </w:r>
     </w:p>
     <w:p>
@@ -599,7 +599,7 @@
         <w:rPr>
           <w:b w:val="0"/>
         </w:rPr>
-        <w:t>前置任务：T11。当前状态：待实施。</w:t>
+        <w:t>前置任务：T11。当前状态：已完成。</w:t>
       </w:r>
     </w:p>
     <w:p>
@@ -616,6 +616,14 @@
           <w:b w:val="0"/>
         </w:rPr>
         <w:t>完成条件：GitHub 包含源码文档；Windows 和 Ubuntu 构建测试通过；没有上游源码副本和本机私密文件。</w:t>
+      </w:r>
+    </w:p>
+    <w:p>
+      <w:r>
+        <w:rPr>
+          <w:b w:val="0"/>
+        </w:rPr>
+        <w:t>验收证据：软件提交 b652181 已推送；GitHub Actions 37200746624 的 Windows、Ubuntu 构建、测试和仓库审查全部通过。记录位于 docs/verification/v1.1-ci.json。</w:t>
       </w:r>
     </w:p>
     <w:p>

</xml_diff>